<commit_message>
Add real-photo generalization test on CNRPark-EXT; remove dead node build scripts
Tests the synthetic-trained detector against 115 real, full-scene CNRPark-EXT
photos (real_photo_test.py streams a small partial download, no 450MB archive
needed). Finding: coarse car-cluster signal transfers, precise localization
and the empty_spot class do not -- consistent with this project's earlier 40%
cross-domain result for the classifier pipeline on the same dataset. Folded
into the report and slides so the real-world validation gap is a measured
result, not an open unknown.

Also removes build_report.js/build_slides.js (node-based, non-functional
without node in this environment, fully superseded by the python
build_report_docx.py / build_slides_pptx.py equivalents).
</commit_message>
<xml_diff>
--- a/smartpark/report_assets/SmartPark_Report.docx
+++ b/smartpark/report_assets/SmartPark_Report.docx
@@ -1994,6 +1994,134 @@
       </w:r>
     </w:p>
     <w:p>
+      <w:pPr>
+        <w:pStyle w:val="Heading2"/>
+      </w:pPr>
+      <w:r>
+        <w:rPr>
+          <w:color w:val="18181B"/>
+        </w:rPr>
+        <w:t>5.1 Real-Photo Generalization Test (Qualitative)</w:t>
+      </w:r>
+    </w:p>
+    <w:p>
+      <w:r>
+        <w:t>The detector above is trained only on synthetic data. To honestly check how it behaves outside that distribution, it was run on 115 real, full-scene photographs from CNRPark-EXT (real_photo_test.py streams a small partial download of the public CNR-EXT_FULL_IMAGE_1000x750 release -- no full 450MB archive needed, just enough bytes to extract several dozen complete JPEGs). CNRPark-EXT is a meaningfully different domain from this project's synthetic data: a steep angled real camera, no painted spot boundary lines, natural lighting, shadows, and background clutter (trees, other vehicles in transit, signage).</w:t>
+      </w:r>
+    </w:p>
+    <w:p>
+      <w:r>
+        <w:t>No ground truth is available for these particular images (CNRPark-EXT's public release ships labels for pre-cropped patches, not bounding boxes for the full-scene images), so this is a qualitative check, not a quantitative mAP figure -- and it is a materially different, harder question than Section 3.2's real-data classifier result, which only had to classify a pre-cropped, pre-located spot, not find one from scratch in a completely unfamiliar layout.</w:t>
+      </w:r>
+    </w:p>
+    <w:p>
+      <w:pPr>
+        <w:jc w:val="center"/>
+      </w:pPr>
+      <w:r>
+        <w:drawing>
+          <wp:inline xmlns:a="http://schemas.openxmlformats.org/drawingml/2006/main" xmlns:pic="http://schemas.openxmlformats.org/drawingml/2006/picture">
+            <wp:extent cx="4572000" cy="3429000"/>
+            <wp:docPr id="9" name="Picture 9"/>
+            <wp:cNvGraphicFramePr>
+              <a:graphicFrameLocks noChangeAspect="1"/>
+            </wp:cNvGraphicFramePr>
+            <a:graphic>
+              <a:graphicData uri="http://schemas.openxmlformats.org/drawingml/2006/picture">
+                <pic:pic>
+                  <pic:nvPicPr>
+                    <pic:cNvPr id="0" name="example_1.jpg"/>
+                    <pic:cNvPicPr/>
+                  </pic:nvPicPr>
+                  <pic:blipFill>
+                    <a:blip r:embed="rId17"/>
+                    <a:stretch>
+                      <a:fillRect/>
+                    </a:stretch>
+                  </pic:blipFill>
+                  <pic:spPr>
+                    <a:xfrm>
+                      <a:off x="0" y="0"/>
+                      <a:ext cx="4572000" cy="3429000"/>
+                    </a:xfrm>
+                    <a:prstGeom prst="rect"/>
+                  </pic:spPr>
+                </pic:pic>
+              </a:graphicData>
+            </a:graphic>
+          </wp:inline>
+        </w:drawing>
+      </w:r>
+    </w:p>
+    <w:p>
+      <w:pPr>
+        <w:jc w:val="center"/>
+      </w:pPr>
+      <w:r>
+        <w:rPr>
+          <w:i/>
+          <w:sz w:val="18"/>
+        </w:rPr>
+        <w:t>Figure: real CNRPark-EXT photo, detector output. Boxes loosely cluster around real cars, but several vehicles are missed and box shapes are imprecise (some are unnaturally tall/narrow).</w:t>
+      </w:r>
+    </w:p>
+    <w:p>
+      <w:pPr>
+        <w:jc w:val="center"/>
+      </w:pPr>
+      <w:r>
+        <w:drawing>
+          <wp:inline xmlns:a="http://schemas.openxmlformats.org/drawingml/2006/main" xmlns:pic="http://schemas.openxmlformats.org/drawingml/2006/picture">
+            <wp:extent cx="4572000" cy="3429000"/>
+            <wp:docPr id="10" name="Picture 10"/>
+            <wp:cNvGraphicFramePr>
+              <a:graphicFrameLocks noChangeAspect="1"/>
+            </wp:cNvGraphicFramePr>
+            <a:graphic>
+              <a:graphicData uri="http://schemas.openxmlformats.org/drawingml/2006/picture">
+                <pic:pic>
+                  <pic:nvPicPr>
+                    <pic:cNvPr id="0" name="example_2.jpg"/>
+                    <pic:cNvPicPr/>
+                  </pic:nvPicPr>
+                  <pic:blipFill>
+                    <a:blip r:embed="rId18"/>
+                    <a:stretch>
+                      <a:fillRect/>
+                    </a:stretch>
+                  </pic:blipFill>
+                  <pic:spPr>
+                    <a:xfrm>
+                      <a:off x="0" y="0"/>
+                      <a:ext cx="4572000" cy="3429000"/>
+                    </a:xfrm>
+                    <a:prstGeom prst="rect"/>
+                  </pic:spPr>
+                </pic:pic>
+              </a:graphicData>
+            </a:graphic>
+          </wp:inline>
+        </w:drawing>
+      </w:r>
+    </w:p>
+    <w:p>
+      <w:pPr>
+        <w:jc w:val="center"/>
+      </w:pPr>
+      <w:r>
+        <w:rPr>
+          <w:i/>
+          <w:sz w:val="18"/>
+        </w:rPr>
+        <w:t>Figure: a busier real lot -- only 4 large, imprecise boxes for dozens of visible cars. Every detection here was classified occupied_spot; empty_spot essentially never fires on these photos, since there are no painted empty bays for it to recognize in this camera's view.</w:t>
+      </w:r>
+    </w:p>
+    <w:p>
+      <w:r>
+        <w:t>Takeaway: the detector carries over a coarse "there is a cluster of cars roughly here" signal, but not reliable per-spot localization or the empty_spot concept, in a domain this different from training. This is consistent with (and about as severe as) this project's own earlier finding for the classifier pipeline: a 5-image pilot test on CNRPark-EXT scored only 2/5 (40%) despite 97%+ accuracy on PKLot. The common thread across both pipelines is that this project's real-data validation (PKLot) and its cross-domain test (CNRPark-EXT) are two different camera setups with different marking conventions -- neither pipeline has yet been trained on data resembling CNRPark-EXT specifically.</w:t>
+      </w:r>
+    </w:p>
+    <w:p>
       <w:r>
         <w:br w:type="page"/>
       </w:r>
@@ -2538,6 +2666,14 @@
     </w:p>
     <w:p>
       <w:pPr>
+        <w:pStyle w:val="ListBullet"/>
+      </w:pPr>
+      <w:r>
+        <w:t>The real-photo generalization test (Section 5.1) confirmed a genuine domain gap rather than assuming one existed: on real CNRPark-EXT photos (a steeper camera angle, no painted lines) the detector finds a rough cluster of real cars but misses most vehicles and never recognizes an empty_spot. This mirrors this project's own earlier 40% cross-domain result for the classifier pipeline on the same dataset -- a consistent signal that PKLot-style training data does not automatically transfer to a differently-marked, differently-angled real lot.</w:t>
+      </w:r>
+    </w:p>
+    <w:p>
+      <w:pPr>
         <w:pStyle w:val="Heading2"/>
       </w:pPr>
       <w:r>
@@ -2572,6 +2708,14 @@
       </w:r>
     </w:p>
     <w:p>
+      <w:pPr>
+        <w:pStyle w:val="ListBullet"/>
+      </w:pPr>
+      <w:r>
+        <w:t>Fine-tune (not just synthetically train) the detector on real photos from the target deployment camera(s) before trusting it there -- the CNRPark-EXT test shows the coarse "cars roughly here" signal transfers, but precise per-spot localization and the empty_spot class do not, without seeing that camera's actual layout during training.</w:t>
+      </w:r>
+    </w:p>
+    <w:p>
       <w:r>
         <w:br w:type="page"/>
       </w:r>
@@ -2589,7 +2733,7 @@
     </w:p>
     <w:p>
       <w:r>
-        <w:t>This project delivers a working object detector, trained from scratch, that finds and classifies parking spots as "empty_spot" or "occupied_spot" directly in full, uncalibrated lot photos, reaching 98.71% mAP@0.5 on held-out synthetic validation data -- clearing a majority-class baseline (53.3%) and this project's own earlier classic-CV heuristic (82.7%) by a wide margin. A second, complementary pipeline (occupancy classifier + geometric misparking check), separately validated on real PKLot photographs at 97.04% accuracy in an earlier session, remains available for cameras with known, calibrated spot boundaries. Both are served live through a Flask REST API and a browser demo that accepts an uploaded photo of any parking lot. The main open item before treating this as production-ready is validating the detector itself (not just the classifier) against real, non-synthetic photographs.</w:t>
+        <w:t>This project delivers a working object detector, trained from scratch, that finds and classifies parking spots as "empty_spot" or "occupied_spot" directly in full, uncalibrated lot photos, reaching 98.71% mAP@0.5 on held-out synthetic validation data -- clearing a majority-class baseline (53.3%) and this project's own earlier classic-CV heuristic (82.7%) by a wide margin. A second, complementary pipeline (occupancy classifier + geometric misparking check), separately validated on real PKLot photographs at 97.04% accuracy in an earlier session, remains available for cameras with known, calibrated spot boundaries. Both are served live through a Flask REST API and a browser demo that accepts an uploaded photo of any parking lot. A qualitative test on 115 real CNRPark-EXT photos (Section 5.1) shows the detector carries over a coarse signal to real images but does not yet generalize precisely to a camera angle and marking style it has never seen -- fine-tuning on photos from the actual target camera(s) is the clear next step before production deployment, not an unexamined unknown.</w:t>
       </w:r>
     </w:p>
     <w:p>

</xml_diff>